<commit_message>
Update: Class Diagram and Finalized Report
</commit_message>
<xml_diff>
--- a/FinalProjectReport.docx
+++ b/FinalProjectReport.docx
@@ -632,23 +632,32 @@
       <w:r>
         <w:rPr>
           <w:rFonts w:ascii="Times New Roman" w:hAnsi="Times New Roman" w:cs="Times New Roman"/>
+          <w:sz w:val="28"/>
+          <w:szCs w:val="28"/>
+        </w:rPr>
+        <w:t>Refined UML Class Diagram with Abstraction and interfaces</w:t>
+      </w:r>
+    </w:p>
+    <w:p>
+      <w:pPr>
+        <w:rPr>
+          <w:rFonts w:ascii="Amasis MT Pro" w:hAnsi="Amasis MT Pro"/>
+          <w:sz w:val="28"/>
+          <w:szCs w:val="28"/>
+        </w:rPr>
+      </w:pPr>
+      <w:r>
+        <w:rPr>
+          <w:rFonts w:ascii="Amasis MT Pro" w:hAnsi="Amasis MT Pro"/>
           <w:noProof/>
           <w:sz w:val="28"/>
           <w:szCs w:val="28"/>
         </w:rPr>
         <w:drawing>
-          <wp:anchor distT="0" distB="0" distL="114300" distR="114300" simplePos="0" relativeHeight="251658240" behindDoc="0" locked="0" layoutInCell="1" allowOverlap="1" wp14:anchorId="358D0C09" wp14:editId="041D8C3B">
-            <wp:simplePos x="0" y="0"/>
-            <wp:positionH relativeFrom="column">
-              <wp:posOffset>0</wp:posOffset>
-            </wp:positionH>
-            <wp:positionV relativeFrom="paragraph">
-              <wp:posOffset>354965</wp:posOffset>
-            </wp:positionV>
-            <wp:extent cx="5731510" cy="3804285"/>
-            <wp:effectExtent l="0" t="0" r="0" b="5715"/>
-            <wp:wrapSquare wrapText="bothSides"/>
-            <wp:docPr id="2076520749" name="Picture 1"/>
+          <wp:inline distT="0" distB="0" distL="0" distR="0" wp14:anchorId="0A75B6A8" wp14:editId="01EE1730">
+            <wp:extent cx="5731510" cy="3409315"/>
+            <wp:effectExtent l="0" t="0" r="0" b="0"/>
+            <wp:docPr id="1982645496" name="Picture 6"/>
             <wp:cNvGraphicFramePr>
               <a:graphicFrameLocks xmlns:a="http://schemas.openxmlformats.org/drawingml/2006/main" noChangeAspect="1"/>
             </wp:cNvGraphicFramePr>
@@ -656,7 +665,7 @@
               <a:graphicData uri="http://schemas.openxmlformats.org/drawingml/2006/picture">
                 <pic:pic xmlns:pic="http://schemas.openxmlformats.org/drawingml/2006/picture">
                   <pic:nvPicPr>
-                    <pic:cNvPr id="2076520749" name="Picture 2076520749"/>
+                    <pic:cNvPr id="1982645496" name="Picture 1982645496"/>
                     <pic:cNvPicPr/>
                   </pic:nvPicPr>
                   <pic:blipFill>
@@ -674,7 +683,7 @@
                   <pic:spPr>
                     <a:xfrm>
                       <a:off x="0" y="0"/>
-                      <a:ext cx="5731510" cy="3804285"/>
+                      <a:ext cx="5731510" cy="3409315"/>
                     </a:xfrm>
                     <a:prstGeom prst="rect">
                       <a:avLst/>
@@ -683,32 +692,9 @@
                 </pic:pic>
               </a:graphicData>
             </a:graphic>
-            <wp14:sizeRelH relativeFrom="page">
-              <wp14:pctWidth>0</wp14:pctWidth>
-            </wp14:sizeRelH>
-            <wp14:sizeRelV relativeFrom="page">
-              <wp14:pctHeight>0</wp14:pctHeight>
-            </wp14:sizeRelV>
-          </wp:anchor>
+          </wp:inline>
         </w:drawing>
       </w:r>
-      <w:r>
-        <w:rPr>
-          <w:rFonts w:ascii="Times New Roman" w:hAnsi="Times New Roman" w:cs="Times New Roman"/>
-          <w:sz w:val="28"/>
-          <w:szCs w:val="28"/>
-        </w:rPr>
-        <w:t>Refined UML Class Diagram with Abstraction and interfaces</w:t>
-      </w:r>
-    </w:p>
-    <w:p>
-      <w:pPr>
-        <w:rPr>
-          <w:rFonts w:ascii="Amasis MT Pro" w:hAnsi="Amasis MT Pro"/>
-          <w:sz w:val="28"/>
-          <w:szCs w:val="28"/>
-        </w:rPr>
-      </w:pPr>
     </w:p>
     <w:p>
       <w:pPr>
@@ -849,7 +835,7 @@
           <w:sz w:val="26"/>
           <w:szCs w:val="26"/>
         </w:rPr>
-        <w:t xml:space="preserve"> entity, enabling ticket management to be handled independently from booking operations. This improves the completeness </w:t>
+        <w:t xml:space="preserve"> entity, enabling ticket management to be handled independently from booking operations. This improves the completeness of the domain model and better reflects real-world airline reservation systems. Additionally, the system applies the Repository Pattern and Service Layer Pattern </w:t>
       </w:r>
       <w:r>
         <w:rPr>
@@ -858,7 +844,7 @@
           <w:szCs w:val="26"/>
         </w:rPr>
         <w:lastRenderedPageBreak/>
-        <w:t>of the domain model and better reflects real-world airline reservation systems. Additionally, the system applies the Repository Pattern and Service Layer Pattern through dedicated repository and service classes, ensuring clear separation between persistence logic and business logic.</w:t>
+        <w:t>through dedicated repository and service classes, ensuring clear separation between persistence logic and business logic.</w:t>
       </w:r>
     </w:p>
     <w:p>
@@ -942,6 +928,15 @@
         <w:pStyle w:val="NormalWeb"/>
         <w:ind w:firstLine="720"/>
         <w:jc w:val="both"/>
+      </w:pPr>
+    </w:p>
+    <w:p>
+      <w:pPr>
+        <w:rPr>
+          <w:rFonts w:ascii="Amasis MT Pro" w:hAnsi="Amasis MT Pro"/>
+          <w:sz w:val="28"/>
+          <w:szCs w:val="28"/>
+        </w:rPr>
       </w:pPr>
     </w:p>
     <w:p>
@@ -4839,10 +4834,18 @@
           <w:szCs w:val="28"/>
         </w:rPr>
         <w:drawing>
-          <wp:inline distT="0" distB="0" distL="0" distR="0" wp14:anchorId="788B1A87" wp14:editId="7459CEAC">
-            <wp:extent cx="5731510" cy="4090670"/>
+          <wp:anchor distT="0" distB="0" distL="114300" distR="114300" simplePos="0" relativeHeight="251670528" behindDoc="0" locked="0" layoutInCell="1" allowOverlap="1" wp14:anchorId="43166801" wp14:editId="5B51F81B">
+            <wp:simplePos x="0" y="0"/>
+            <wp:positionH relativeFrom="column">
+              <wp:posOffset>0</wp:posOffset>
+            </wp:positionH>
+            <wp:positionV relativeFrom="paragraph">
+              <wp:posOffset>4445</wp:posOffset>
+            </wp:positionV>
+            <wp:extent cx="5731510" cy="4814570"/>
             <wp:effectExtent l="0" t="0" r="0" b="0"/>
-            <wp:docPr id="15148823" name="Picture 10"/>
+            <wp:wrapSquare wrapText="bothSides"/>
+            <wp:docPr id="1296564369" name="Picture 7"/>
             <wp:cNvGraphicFramePr>
               <a:graphicFrameLocks xmlns:a="http://schemas.openxmlformats.org/drawingml/2006/main" noChangeAspect="1"/>
             </wp:cNvGraphicFramePr>
@@ -4850,7 +4853,7 @@
               <a:graphicData uri="http://schemas.openxmlformats.org/drawingml/2006/picture">
                 <pic:pic xmlns:pic="http://schemas.openxmlformats.org/drawingml/2006/picture">
                   <pic:nvPicPr>
-                    <pic:cNvPr id="15148823" name="Picture 15148823"/>
+                    <pic:cNvPr id="1296564369" name="Picture 1296564369"/>
                     <pic:cNvPicPr/>
                   </pic:nvPicPr>
                   <pic:blipFill>
@@ -4868,7 +4871,7 @@
                   <pic:spPr>
                     <a:xfrm>
                       <a:off x="0" y="0"/>
-                      <a:ext cx="5731510" cy="4090670"/>
+                      <a:ext cx="5731510" cy="4814570"/>
                     </a:xfrm>
                     <a:prstGeom prst="rect">
                       <a:avLst/>
@@ -4877,7 +4880,13 @@
                 </pic:pic>
               </a:graphicData>
             </a:graphic>
-          </wp:inline>
+            <wp14:sizeRelH relativeFrom="page">
+              <wp14:pctWidth>0</wp14:pctWidth>
+            </wp14:sizeRelH>
+            <wp14:sizeRelV relativeFrom="page">
+              <wp14:pctHeight>0</wp14:pctHeight>
+            </wp14:sizeRelV>
+          </wp:anchor>
         </w:drawing>
       </w:r>
     </w:p>
@@ -5058,36 +5067,6 @@
         </w:rPr>
         <w:t xml:space="preserve"> has dependency relationships with both subclasses because it is responsible for creating their objects. This demonstrates how object creation is separated from the main business logic while still supporting the inheritance-based user model.</w:t>
       </w:r>
-    </w:p>
-    <w:p>
-      <w:pPr>
-        <w:jc w:val="both"/>
-        <w:rPr>
-          <w:rFonts w:ascii="Times New Roman" w:hAnsi="Times New Roman" w:cs="Times New Roman"/>
-          <w:sz w:val="26"/>
-          <w:szCs w:val="26"/>
-        </w:rPr>
-      </w:pPr>
-    </w:p>
-    <w:p>
-      <w:pPr>
-        <w:jc w:val="both"/>
-        <w:rPr>
-          <w:rFonts w:ascii="Times New Roman" w:hAnsi="Times New Roman" w:cs="Times New Roman"/>
-          <w:sz w:val="26"/>
-          <w:szCs w:val="26"/>
-        </w:rPr>
-      </w:pPr>
-    </w:p>
-    <w:p>
-      <w:pPr>
-        <w:jc w:val="both"/>
-        <w:rPr>
-          <w:rFonts w:ascii="Times New Roman" w:hAnsi="Times New Roman" w:cs="Times New Roman"/>
-          <w:sz w:val="26"/>
-          <w:szCs w:val="26"/>
-        </w:rPr>
-      </w:pPr>
     </w:p>
     <w:p>
       <w:pPr>
@@ -5140,10 +5119,18 @@
           <w:szCs w:val="26"/>
         </w:rPr>
         <w:drawing>
-          <wp:inline distT="0" distB="0" distL="0" distR="0" wp14:anchorId="4C5ED07E" wp14:editId="79BFBB15">
-            <wp:extent cx="5731510" cy="3183255"/>
-            <wp:effectExtent l="0" t="0" r="0" b="4445"/>
-            <wp:docPr id="1552878375" name="Picture 11"/>
+          <wp:anchor distT="0" distB="0" distL="114300" distR="114300" simplePos="0" relativeHeight="251667456" behindDoc="0" locked="0" layoutInCell="1" allowOverlap="1" wp14:anchorId="1AA150D5" wp14:editId="7F897893">
+            <wp:simplePos x="0" y="0"/>
+            <wp:positionH relativeFrom="column">
+              <wp:posOffset>0</wp:posOffset>
+            </wp:positionH>
+            <wp:positionV relativeFrom="paragraph">
+              <wp:posOffset>0</wp:posOffset>
+            </wp:positionV>
+            <wp:extent cx="5731510" cy="3187065"/>
+            <wp:effectExtent l="0" t="0" r="0" b="635"/>
+            <wp:wrapSquare wrapText="bothSides"/>
+            <wp:docPr id="145653180" name="Picture 3"/>
             <wp:cNvGraphicFramePr>
               <a:graphicFrameLocks xmlns:a="http://schemas.openxmlformats.org/drawingml/2006/main" noChangeAspect="1"/>
             </wp:cNvGraphicFramePr>
@@ -5151,7 +5138,7 @@
               <a:graphicData uri="http://schemas.openxmlformats.org/drawingml/2006/picture">
                 <pic:pic xmlns:pic="http://schemas.openxmlformats.org/drawingml/2006/picture">
                   <pic:nvPicPr>
-                    <pic:cNvPr id="1552878375" name="Picture 1552878375"/>
+                    <pic:cNvPr id="145653180" name="Picture 145653180"/>
                     <pic:cNvPicPr/>
                   </pic:nvPicPr>
                   <pic:blipFill>
@@ -5169,7 +5156,7 @@
                   <pic:spPr>
                     <a:xfrm>
                       <a:off x="0" y="0"/>
-                      <a:ext cx="5731510" cy="3183255"/>
+                      <a:ext cx="5731510" cy="3187065"/>
                     </a:xfrm>
                     <a:prstGeom prst="rect">
                       <a:avLst/>
@@ -5178,7 +5165,13 @@
                 </pic:pic>
               </a:graphicData>
             </a:graphic>
-          </wp:inline>
+            <wp14:sizeRelH relativeFrom="page">
+              <wp14:pctWidth>0</wp14:pctWidth>
+            </wp14:sizeRelH>
+            <wp14:sizeRelV relativeFrom="page">
+              <wp14:pctHeight>0</wp14:pctHeight>
+            </wp14:sizeRelV>
+          </wp:anchor>
         </w:drawing>
       </w:r>
     </w:p>
@@ -5287,15 +5280,6 @@
         </w:rPr>
         <w:t>These UML diagrams support the implementation by making the design pattern structures explicit and showing how each pattern is integrated into the overall class architecture.</w:t>
       </w:r>
-    </w:p>
-    <w:p>
-      <w:pPr>
-        <w:rPr>
-          <w:rFonts w:ascii="Amasis MT Pro" w:hAnsi="Amasis MT Pro"/>
-          <w:sz w:val="28"/>
-          <w:szCs w:val="28"/>
-        </w:rPr>
-      </w:pPr>
     </w:p>
     <w:p>
       <w:pPr>
@@ -5411,21 +5395,35 @@
       </w:pPr>
       <w:r>
         <w:rPr>
+          <w:rFonts w:ascii="Amasis MT Pro" w:hAnsi="Amasis MT Pro"/>
+          <w:sz w:val="28"/>
+          <w:szCs w:val="28"/>
+        </w:rPr>
+        <w:t>Singleton Pattern in DatabaseConnection Class</w:t>
+      </w:r>
+    </w:p>
+    <w:p>
+      <w:pPr>
+        <w:pStyle w:val="NormalWeb"/>
+      </w:pPr>
+      <w:r>
+        <w:rPr>
           <w:noProof/>
+          <w14:ligatures w14:val="standardContextual"/>
         </w:rPr>
         <w:drawing>
-          <wp:anchor distT="0" distB="0" distL="114300" distR="114300" simplePos="0" relativeHeight="251664384" behindDoc="0" locked="0" layoutInCell="1" allowOverlap="1" wp14:anchorId="1E84DF88" wp14:editId="2BD9A085">
+          <wp:anchor distT="0" distB="0" distL="114300" distR="114300" simplePos="0" relativeHeight="251668480" behindDoc="0" locked="0" layoutInCell="1" allowOverlap="1" wp14:anchorId="1EAEA178" wp14:editId="19861554">
             <wp:simplePos x="0" y="0"/>
             <wp:positionH relativeFrom="column">
-              <wp:posOffset>-101600</wp:posOffset>
+              <wp:posOffset>0</wp:posOffset>
             </wp:positionH>
             <wp:positionV relativeFrom="paragraph">
-              <wp:posOffset>368300</wp:posOffset>
+              <wp:posOffset>76200</wp:posOffset>
             </wp:positionV>
-            <wp:extent cx="5731510" cy="6351905"/>
-            <wp:effectExtent l="0" t="0" r="0" b="1270"/>
+            <wp:extent cx="5731510" cy="7282815"/>
+            <wp:effectExtent l="0" t="0" r="0" b="0"/>
             <wp:wrapSquare wrapText="bothSides"/>
-            <wp:docPr id="1928296012" name="Picture 12"/>
+            <wp:docPr id="856386194" name="Picture 4"/>
             <wp:cNvGraphicFramePr>
               <a:graphicFrameLocks xmlns:a="http://schemas.openxmlformats.org/drawingml/2006/main" noChangeAspect="1"/>
             </wp:cNvGraphicFramePr>
@@ -5433,7 +5431,7 @@
               <a:graphicData uri="http://schemas.openxmlformats.org/drawingml/2006/picture">
                 <pic:pic xmlns:pic="http://schemas.openxmlformats.org/drawingml/2006/picture">
                   <pic:nvPicPr>
-                    <pic:cNvPr id="1928296012" name="Picture 1928296012"/>
+                    <pic:cNvPr id="856386194" name="Picture 856386194"/>
                     <pic:cNvPicPr/>
                   </pic:nvPicPr>
                   <pic:blipFill>
@@ -5451,7 +5449,7 @@
                   <pic:spPr>
                     <a:xfrm>
                       <a:off x="0" y="0"/>
-                      <a:ext cx="5731510" cy="6351905"/>
+                      <a:ext cx="5731510" cy="7282815"/>
                     </a:xfrm>
                     <a:prstGeom prst="rect">
                       <a:avLst/>
@@ -5469,19 +5467,6 @@
           </wp:anchor>
         </w:drawing>
       </w:r>
-      <w:r>
-        <w:rPr>
-          <w:rFonts w:ascii="Amasis MT Pro" w:hAnsi="Amasis MT Pro"/>
-          <w:sz w:val="28"/>
-          <w:szCs w:val="28"/>
-        </w:rPr>
-        <w:t>Singleton Pattern in DatabaseConnection Class</w:t>
-      </w:r>
-    </w:p>
-    <w:p>
-      <w:pPr>
-        <w:pStyle w:val="NormalWeb"/>
-      </w:pPr>
     </w:p>
     <w:p>
       <w:pPr>
@@ -5499,6 +5484,7 @@
           <w:sz w:val="26"/>
           <w:szCs w:val="26"/>
         </w:rPr>
+        <w:lastRenderedPageBreak/>
         <w:t xml:space="preserve">The </w:t>
       </w:r>
       <w:r>
@@ -5566,16 +5552,7 @@
           <w:sz w:val="26"/>
           <w:szCs w:val="26"/>
         </w:rPr>
-        <w:t xml:space="preserve">, which stores the single object of the class. The </w:t>
-      </w:r>
-      <w:r>
-        <w:rPr>
-          <w:rFonts w:ascii="Times New Roman" w:hAnsi="Times New Roman" w:cs="Times New Roman"/>
-          <w:sz w:val="26"/>
-          <w:szCs w:val="26"/>
-        </w:rPr>
-        <w:lastRenderedPageBreak/>
-        <w:t xml:space="preserve">constructor is declared as </w:t>
+        <w:t xml:space="preserve">, which stores the single object of the class. The constructor is declared as </w:t>
       </w:r>
       <w:r>
         <w:rPr>
@@ -5892,24 +5869,60 @@
       <w:r>
         <w:rPr>
           <w:rFonts w:ascii="Amasis MT Pro" w:hAnsi="Amasis MT Pro"/>
+          <w:sz w:val="28"/>
+          <w:szCs w:val="28"/>
+        </w:rPr>
+        <w:lastRenderedPageBreak/>
+        <w:t>Factory Method (</w:t>
+      </w:r>
+      <w:proofErr w:type="spellStart"/>
+      <w:r>
+        <w:rPr>
+          <w:rFonts w:ascii="Amasis MT Pro" w:hAnsi="Amasis MT Pro"/>
+          <w:sz w:val="28"/>
+          <w:szCs w:val="28"/>
+        </w:rPr>
+        <w:t>UserFactory</w:t>
+      </w:r>
+      <w:proofErr w:type="spellEnd"/>
+      <w:r>
+        <w:rPr>
+          <w:rFonts w:ascii="Amasis MT Pro" w:hAnsi="Amasis MT Pro"/>
+          <w:sz w:val="28"/>
+          <w:szCs w:val="28"/>
+        </w:rPr>
+        <w:t>)</w:t>
+      </w:r>
+    </w:p>
+    <w:p>
+      <w:pPr>
+        <w:jc w:val="both"/>
+        <w:rPr>
+          <w:rFonts w:ascii="Times New Roman" w:hAnsi="Times New Roman" w:cs="Times New Roman"/>
+          <w:sz w:val="26"/>
+          <w:szCs w:val="26"/>
+        </w:rPr>
+      </w:pPr>
+      <w:r>
+        <w:rPr>
+          <w:rFonts w:ascii="Times New Roman" w:hAnsi="Times New Roman" w:cs="Times New Roman"/>
           <w:noProof/>
-          <w:sz w:val="28"/>
-          <w:szCs w:val="28"/>
-        </w:rPr>
-        <w:lastRenderedPageBreak/>
+          <w:sz w:val="26"/>
+          <w:szCs w:val="26"/>
+        </w:rPr>
         <w:drawing>
-          <wp:anchor distT="0" distB="0" distL="114300" distR="114300" simplePos="0" relativeHeight="251665408" behindDoc="0" locked="0" layoutInCell="1" allowOverlap="1" wp14:anchorId="120AE21D" wp14:editId="2EB33863">
+          <wp:anchor distT="0" distB="0" distL="114300" distR="114300" simplePos="0" relativeHeight="251669504" behindDoc="0" locked="0" layoutInCell="1" allowOverlap="1" wp14:anchorId="7ACE959A" wp14:editId="6DC6C072">
             <wp:simplePos x="0" y="0"/>
             <wp:positionH relativeFrom="column">
-              <wp:posOffset>-114300</wp:posOffset>
+              <wp:posOffset>0</wp:posOffset>
             </wp:positionH>
             <wp:positionV relativeFrom="paragraph">
-              <wp:posOffset>431800</wp:posOffset>
+              <wp:posOffset>4445</wp:posOffset>
             </wp:positionV>
-            <wp:extent cx="5731510" cy="6438265"/>
-            <wp:effectExtent l="0" t="0" r="0" b="635"/>
+            <wp:extent cx="5731510" cy="6176645"/>
+            <wp:effectExtent l="0" t="0" r="0" b="0"/>
             <wp:wrapSquare wrapText="bothSides"/>
-            <wp:docPr id="269327596" name="Picture 14"/>
+            <wp:docPr id="503195155" name="Picture 5"/>
             <wp:cNvGraphicFramePr>
               <a:graphicFrameLocks xmlns:a="http://schemas.openxmlformats.org/drawingml/2006/main" noChangeAspect="1"/>
             </wp:cNvGraphicFramePr>
@@ -5917,7 +5930,7 @@
               <a:graphicData uri="http://schemas.openxmlformats.org/drawingml/2006/picture">
                 <pic:pic xmlns:pic="http://schemas.openxmlformats.org/drawingml/2006/picture">
                   <pic:nvPicPr>
-                    <pic:cNvPr id="269327596" name="Picture 269327596"/>
+                    <pic:cNvPr id="503195155" name="Picture 503195155"/>
                     <pic:cNvPicPr/>
                   </pic:nvPicPr>
                   <pic:blipFill>
@@ -5935,7 +5948,7 @@
                   <pic:spPr>
                     <a:xfrm>
                       <a:off x="0" y="0"/>
-                      <a:ext cx="5731510" cy="6438265"/>
+                      <a:ext cx="5731510" cy="6176645"/>
                     </a:xfrm>
                     <a:prstGeom prst="rect">
                       <a:avLst/>
@@ -5953,42 +5966,6 @@
           </wp:anchor>
         </w:drawing>
       </w:r>
-      <w:r>
-        <w:rPr>
-          <w:rFonts w:ascii="Amasis MT Pro" w:hAnsi="Amasis MT Pro"/>
-          <w:sz w:val="28"/>
-          <w:szCs w:val="28"/>
-        </w:rPr>
-        <w:t>Factory Method (</w:t>
-      </w:r>
-      <w:proofErr w:type="spellStart"/>
-      <w:r>
-        <w:rPr>
-          <w:rFonts w:ascii="Amasis MT Pro" w:hAnsi="Amasis MT Pro"/>
-          <w:sz w:val="28"/>
-          <w:szCs w:val="28"/>
-        </w:rPr>
-        <w:t>UserFactory</w:t>
-      </w:r>
-      <w:proofErr w:type="spellEnd"/>
-      <w:r>
-        <w:rPr>
-          <w:rFonts w:ascii="Amasis MT Pro" w:hAnsi="Amasis MT Pro"/>
-          <w:sz w:val="28"/>
-          <w:szCs w:val="28"/>
-        </w:rPr>
-        <w:t>)</w:t>
-      </w:r>
-    </w:p>
-    <w:p>
-      <w:pPr>
-        <w:jc w:val="both"/>
-        <w:rPr>
-          <w:rFonts w:ascii="Times New Roman" w:hAnsi="Times New Roman" w:cs="Times New Roman"/>
-          <w:sz w:val="26"/>
-          <w:szCs w:val="26"/>
-        </w:rPr>
-      </w:pPr>
     </w:p>
     <w:p>
       <w:pPr>
@@ -6526,10 +6503,10 @@
           <w:szCs w:val="26"/>
         </w:rPr>
         <w:drawing>
-          <wp:inline distT="0" distB="0" distL="0" distR="0" wp14:anchorId="614A3D58" wp14:editId="676EDC51">
-            <wp:extent cx="5731510" cy="3406140"/>
+          <wp:inline distT="0" distB="0" distL="0" distR="0" wp14:anchorId="4B0E8E20" wp14:editId="6D16E06F">
+            <wp:extent cx="5731510" cy="3409315"/>
             <wp:effectExtent l="0" t="0" r="0" b="0"/>
-            <wp:docPr id="137234348" name="Picture 16"/>
+            <wp:docPr id="911356822" name="Picture 8"/>
             <wp:cNvGraphicFramePr>
               <a:graphicFrameLocks xmlns:a="http://schemas.openxmlformats.org/drawingml/2006/main" noChangeAspect="1"/>
             </wp:cNvGraphicFramePr>
@@ -6537,11 +6514,11 @@
               <a:graphicData uri="http://schemas.openxmlformats.org/drawingml/2006/picture">
                 <pic:pic xmlns:pic="http://schemas.openxmlformats.org/drawingml/2006/picture">
                   <pic:nvPicPr>
-                    <pic:cNvPr id="137234348" name="Picture 137234348"/>
+                    <pic:cNvPr id="911356822" name="Picture 911356822"/>
                     <pic:cNvPicPr/>
                   </pic:nvPicPr>
                   <pic:blipFill>
-                    <a:blip r:embed="rId18" cstate="print">
+                    <a:blip r:embed="rId6" cstate="print">
                       <a:extLst>
                         <a:ext uri="{28A0092B-C50C-407E-A947-70E740481C1C}">
                           <a14:useLocalDpi xmlns:a14="http://schemas.microsoft.com/office/drawing/2010/main" val="0"/>
@@ -6555,7 +6532,7 @@
                   <pic:spPr>
                     <a:xfrm>
                       <a:off x="0" y="0"/>
-                      <a:ext cx="5731510" cy="3406140"/>
+                      <a:ext cx="5731510" cy="3409315"/>
                     </a:xfrm>
                     <a:prstGeom prst="rect">
                       <a:avLst/>
@@ -7375,32 +7352,14 @@
           <w:szCs w:val="26"/>
         </w:rPr>
       </w:pPr>
-      <w:proofErr w:type="spellStart"/>
-      <w:r>
-        <w:rPr>
-          <w:rFonts w:ascii="Times New Roman" w:hAnsi="Times New Roman" w:cs="Times New Roman"/>
-          <w:sz w:val="26"/>
-          <w:szCs w:val="26"/>
-        </w:rPr>
-        <w:t>T</w:t>
-      </w:r>
-      <w:r>
-        <w:rPr>
-          <w:rFonts w:ascii="Times New Roman" w:hAnsi="Times New Roman" w:cs="Times New Roman"/>
-          <w:sz w:val="26"/>
-          <w:szCs w:val="26"/>
-        </w:rPr>
-        <w:tab/>
-      </w:r>
-      <w:r>
-        <w:rPr>
-          <w:rFonts w:ascii="Times New Roman" w:hAnsi="Times New Roman" w:cs="Times New Roman"/>
-          <w:sz w:val="26"/>
-          <w:szCs w:val="26"/>
-        </w:rPr>
-        <w:t>he</w:t>
-      </w:r>
-      <w:proofErr w:type="spellEnd"/>
+      <w:r>
+        <w:rPr>
+          <w:rFonts w:ascii="Times New Roman" w:hAnsi="Times New Roman" w:cs="Times New Roman"/>
+          <w:sz w:val="26"/>
+          <w:szCs w:val="26"/>
+        </w:rPr>
+        <w:t>The</w:t>
+      </w:r>
       <w:r>
         <w:rPr>
           <w:rFonts w:ascii="Times New Roman" w:hAnsi="Times New Roman" w:cs="Times New Roman"/>
@@ -10584,7 +10543,10 @@
   </w:compat>
   <w:rsids>
     <w:rsidRoot w:val="00B551AD"/>
+    <w:rsid w:val="00432518"/>
     <w:rsid w:val="004C3359"/>
+    <w:rsid w:val="0071370C"/>
+    <w:rsid w:val="00B056F1"/>
     <w:rsid w:val="00B551AD"/>
     <w:rsid w:val="00FE070D"/>
   </w:rsids>

</xml_diff>